<commit_message>
Updated apps master formatting
Applied table formatting and styling to apps_master.xlsx
</commit_message>
<xml_diff>
--- a/docs/Project_Proposal.docx
+++ b/docs/Project_Proposal.docx
@@ -9,16 +9,25 @@
           <w:bCs/>
         </w:rPr>
       </w:pPr>
+    </w:p>
+    <w:p>
+      <w:pPr>
+        <w:rPr>
+          <w:b/>
+          <w:bCs/>
+          <w:color w:val="2F5496" w:themeColor="accent1" w:themeShade="BF"/>
+          <w:sz w:val="40"/>
+          <w:szCs w:val="40"/>
+        </w:rPr>
+      </w:pPr>
       <w:r>
         <w:rPr>
           <w:b/>
           <w:bCs/>
+          <w:color w:val="2F5496" w:themeColor="accent1" w:themeShade="BF"/>
+          <w:sz w:val="40"/>
+          <w:szCs w:val="40"/>
         </w:rPr>
-        <w:t>Title</w:t>
-      </w:r>
-    </w:p>
-    <w:p>
-      <w:r>
         <w:t>Dark Pattern Impact Analytics &amp; Trust Score System</w:t>
       </w:r>
     </w:p>
@@ -27,49 +36,208 @@
         <w:rPr>
           <w:b/>
           <w:bCs/>
+          <w:color w:val="2F5496" w:themeColor="accent1" w:themeShade="BF"/>
+          <w:sz w:val="28"/>
+          <w:szCs w:val="28"/>
         </w:rPr>
       </w:pPr>
       <w:r>
         <w:rPr>
           <w:b/>
           <w:bCs/>
+          <w:color w:val="2F5496" w:themeColor="accent1" w:themeShade="BF"/>
+          <w:sz w:val="28"/>
+          <w:szCs w:val="28"/>
         </w:rPr>
         <w:t>Team Members</w:t>
       </w:r>
     </w:p>
-    <w:p>
-      <w:pPr>
-        <w:numPr>
-          <w:ilvl w:val="0"/>
-          <w:numId w:val="1"/>
-        </w:numPr>
-      </w:pPr>
-      <w:r>
-        <w:t xml:space="preserve">Santhosh </w:t>
-      </w:r>
-    </w:p>
-    <w:p>
-      <w:pPr>
-        <w:numPr>
-          <w:ilvl w:val="0"/>
-          <w:numId w:val="1"/>
-        </w:numPr>
-      </w:pPr>
-      <w:r>
-        <w:t xml:space="preserve">Beulah </w:t>
-      </w:r>
-    </w:p>
+    <w:tbl>
+      <w:tblPr>
+        <w:tblW w:w="0" w:type="auto"/>
+        <w:tblCellSpacing w:w="15" w:type="dxa"/>
+        <w:tblBorders>
+          <w:top w:val="single" w:sz="4" w:space="0" w:color="auto"/>
+          <w:left w:val="single" w:sz="4" w:space="0" w:color="auto"/>
+          <w:bottom w:val="single" w:sz="4" w:space="0" w:color="auto"/>
+          <w:right w:val="single" w:sz="4" w:space="0" w:color="auto"/>
+          <w:insideH w:val="single" w:sz="4" w:space="0" w:color="auto"/>
+          <w:insideV w:val="single" w:sz="4" w:space="0" w:color="auto"/>
+        </w:tblBorders>
+        <w:tblCellMar>
+          <w:top w:w="15" w:type="dxa"/>
+          <w:left w:w="15" w:type="dxa"/>
+          <w:bottom w:w="15" w:type="dxa"/>
+          <w:right w:w="15" w:type="dxa"/>
+        </w:tblCellMar>
+        <w:tblLook w:val="04A0" w:firstRow="1" w:lastRow="0" w:firstColumn="1" w:lastColumn="0" w:noHBand="0" w:noVBand="1"/>
+      </w:tblPr>
+      <w:tblGrid>
+        <w:gridCol w:w="1413"/>
+        <w:gridCol w:w="1984"/>
+      </w:tblGrid>
+      <w:tr>
+        <w:trPr>
+          <w:tblHeader/>
+          <w:tblCellSpacing w:w="15" w:type="dxa"/>
+        </w:trPr>
+        <w:tc>
+          <w:tcPr>
+            <w:tcW w:w="1368" w:type="dxa"/>
+            <w:vAlign w:val="center"/>
+            <w:hideMark/>
+          </w:tcPr>
+          <w:p>
+            <w:pPr>
+              <w:rPr>
+                <w:b/>
+                <w:bCs/>
+                <w:color w:val="2F5496" w:themeColor="accent1" w:themeShade="BF"/>
+              </w:rPr>
+            </w:pPr>
+            <w:r>
+              <w:rPr>
+                <w:b/>
+                <w:bCs/>
+                <w:color w:val="2F5496" w:themeColor="accent1" w:themeShade="BF"/>
+              </w:rPr>
+              <w:t>Role</w:t>
+            </w:r>
+          </w:p>
+        </w:tc>
+        <w:tc>
+          <w:tcPr>
+            <w:tcW w:w="1939" w:type="dxa"/>
+            <w:vAlign w:val="center"/>
+            <w:hideMark/>
+          </w:tcPr>
+          <w:p>
+            <w:pPr>
+              <w:rPr>
+                <w:b/>
+                <w:bCs/>
+                <w:color w:val="2F5496" w:themeColor="accent1" w:themeShade="BF"/>
+              </w:rPr>
+            </w:pPr>
+            <w:r>
+              <w:rPr>
+                <w:b/>
+                <w:bCs/>
+                <w:color w:val="2F5496" w:themeColor="accent1" w:themeShade="BF"/>
+              </w:rPr>
+              <w:t>Name</w:t>
+            </w:r>
+          </w:p>
+        </w:tc>
+      </w:tr>
+      <w:tr>
+        <w:trPr>
+          <w:tblCellSpacing w:w="15" w:type="dxa"/>
+        </w:trPr>
+        <w:tc>
+          <w:tcPr>
+            <w:tcW w:w="1368" w:type="dxa"/>
+            <w:vAlign w:val="center"/>
+            <w:hideMark/>
+          </w:tcPr>
+          <w:p>
+            <w:pPr>
+              <w:rPr>
+                <w:color w:val="000000" w:themeColor="text1"/>
+              </w:rPr>
+            </w:pPr>
+            <w:r>
+              <w:rPr>
+                <w:color w:val="000000" w:themeColor="text1"/>
+              </w:rPr>
+              <w:t>Member 1</w:t>
+            </w:r>
+          </w:p>
+        </w:tc>
+        <w:tc>
+          <w:tcPr>
+            <w:tcW w:w="1939" w:type="dxa"/>
+            <w:vAlign w:val="center"/>
+            <w:hideMark/>
+          </w:tcPr>
+          <w:p>
+            <w:pPr>
+              <w:rPr>
+                <w:color w:val="000000" w:themeColor="text1"/>
+              </w:rPr>
+            </w:pPr>
+            <w:r>
+              <w:rPr>
+                <w:color w:val="000000" w:themeColor="text1"/>
+              </w:rPr>
+              <w:t>Santhosh</w:t>
+            </w:r>
+          </w:p>
+        </w:tc>
+      </w:tr>
+      <w:tr>
+        <w:trPr>
+          <w:tblCellSpacing w:w="15" w:type="dxa"/>
+        </w:trPr>
+        <w:tc>
+          <w:tcPr>
+            <w:tcW w:w="1368" w:type="dxa"/>
+            <w:vAlign w:val="center"/>
+            <w:hideMark/>
+          </w:tcPr>
+          <w:p>
+            <w:pPr>
+              <w:rPr>
+                <w:color w:val="000000" w:themeColor="text1"/>
+              </w:rPr>
+            </w:pPr>
+            <w:r>
+              <w:rPr>
+                <w:color w:val="000000" w:themeColor="text1"/>
+              </w:rPr>
+              <w:t>Member 2</w:t>
+            </w:r>
+          </w:p>
+        </w:tc>
+        <w:tc>
+          <w:tcPr>
+            <w:tcW w:w="1939" w:type="dxa"/>
+            <w:vAlign w:val="center"/>
+            <w:hideMark/>
+          </w:tcPr>
+          <w:p>
+            <w:pPr>
+              <w:rPr>
+                <w:color w:val="000000" w:themeColor="text1"/>
+              </w:rPr>
+            </w:pPr>
+            <w:r>
+              <w:rPr>
+                <w:color w:val="000000" w:themeColor="text1"/>
+              </w:rPr>
+              <w:t>Beulah</w:t>
+            </w:r>
+          </w:p>
+        </w:tc>
+      </w:tr>
+    </w:tbl>
     <w:p>
       <w:pPr>
         <w:rPr>
           <w:b/>
           <w:bCs/>
+          <w:color w:val="2F5496" w:themeColor="accent1" w:themeShade="BF"/>
+          <w:sz w:val="28"/>
+          <w:szCs w:val="28"/>
         </w:rPr>
       </w:pPr>
       <w:r>
         <w:rPr>
           <w:b/>
           <w:bCs/>
+          <w:color w:val="2F5496" w:themeColor="accent1" w:themeShade="BF"/>
+          <w:sz w:val="28"/>
+          <w:szCs w:val="28"/>
         </w:rPr>
         <w:t>Problem Statement</w:t>
       </w:r>
@@ -92,12 +260,18 @@
         <w:rPr>
           <w:b/>
           <w:bCs/>
+          <w:color w:val="2F5496" w:themeColor="accent1" w:themeShade="BF"/>
+          <w:sz w:val="28"/>
+          <w:szCs w:val="28"/>
         </w:rPr>
       </w:pPr>
       <w:r>
         <w:rPr>
           <w:b/>
           <w:bCs/>
+          <w:color w:val="2F5496" w:themeColor="accent1" w:themeShade="BF"/>
+          <w:sz w:val="28"/>
+          <w:szCs w:val="28"/>
         </w:rPr>
         <w:t>Objectives</w:t>
       </w:r>
@@ -167,12 +341,18 @@
         <w:rPr>
           <w:b/>
           <w:bCs/>
+          <w:color w:val="2F5496" w:themeColor="accent1" w:themeShade="BF"/>
+          <w:sz w:val="28"/>
+          <w:szCs w:val="28"/>
         </w:rPr>
       </w:pPr>
       <w:r>
         <w:rPr>
           <w:b/>
           <w:bCs/>
+          <w:color w:val="2F5496" w:themeColor="accent1" w:themeShade="BF"/>
+          <w:sz w:val="28"/>
+          <w:szCs w:val="28"/>
         </w:rPr>
         <w:t>Tools</w:t>
       </w:r>
@@ -237,12 +417,18 @@
         <w:rPr>
           <w:b/>
           <w:bCs/>
+          <w:color w:val="2F5496" w:themeColor="accent1" w:themeShade="BF"/>
+          <w:sz w:val="28"/>
+          <w:szCs w:val="28"/>
         </w:rPr>
       </w:pPr>
       <w:r>
         <w:rPr>
           <w:b/>
           <w:bCs/>
+          <w:color w:val="2F5496" w:themeColor="accent1" w:themeShade="BF"/>
+          <w:sz w:val="28"/>
+          <w:szCs w:val="28"/>
         </w:rPr>
         <w:t>Duration</w:t>
       </w:r>

</xml_diff>